<commit_message>
feat: update parcel pickup, special deliveries and multiplayer minimap
일반 택배 접촉 자동 획득, 취급주의 광채 강화, 원격 배송기 36m와 미니맵 회전 중심 수정 및 실제 방장·게스트 검증을 반영한다. 누적된 전투·네트워크 개선, 특수 아이템 에셋과 자료실 상세 보고서 및 검사 근거를 함께 기록한다.
</commit_message>
<xml_diff>
--- a/Docs/ChangeRecords/20261016/ChangeReport_20261016.docx
+++ b/Docs/ChangeRecords/20261016/ChangeReport_20261016.docx
@@ -8,7 +8,7 @@
         <w:keepLines/>
       </w:pPr>
       <w:r>
-        <w:t>택배 무작위 배치와 재생성 변경 보고서</w:t>
+        <w:t>택배 배치와 멀티플레이 수정 보고서</w:t>
       </w:r>
     </w:p>
     <w:p>
@@ -280,7 +280,7 @@
                     <pic:cNvPicPr/>
                   </pic:nvPicPr>
                   <pic:blipFill>
-                    <a:blip r:embed="rId22"/>
+                    <a:blip r:embed="rId9"/>
                     <a:stretch>
                       <a:fillRect/>
                     </a:stretch>
@@ -366,7 +366,7 @@
                     <pic:cNvPicPr/>
                   </pic:nvPicPr>
                   <pic:blipFill>
-                    <a:blip r:embed="rId23"/>
+                    <a:blip r:embed="rId10"/>
                     <a:stretch>
                       <a:fillRect/>
                     </a:stretch>
@@ -434,7 +434,7 @@
                           <pic:cNvPicPr/>
                         </pic:nvPicPr>
                         <pic:blipFill>
-                          <a:blip r:embed="rId24"/>
+                          <a:blip r:embed="rId11"/>
                           <a:stretch>
                             <a:fillRect/>
                           </a:stretch>
@@ -483,7 +483,7 @@
                           <pic:cNvPicPr/>
                         </pic:nvPicPr>
                         <pic:blipFill>
-                          <a:blip r:embed="rId25"/>
+                          <a:blip r:embed="rId12"/>
                           <a:stretch>
                             <a:fillRect/>
                           </a:stretch>
@@ -832,6 +832,1360 @@
         <w:t>MonsterDeliveryService_20261016.zip 전체를 압축 해제한 뒤 MonsterDeliveryService.exe를 실행한다. 1대1과 2대2 메뉴 및 Tailscale 주소 입력 방식은 유지한다. 택배 동기화 형식이 바뀌었으므로 모든 참가자는 이번 새 버전을 사용한다. 원본 소스·후보 좌표·캡처·전체 PASS 로그는 날짜별 기록 폴더에 보존했다.</w:t>
       </w:r>
     </w:p>
+    <w:p>
+      <w:pPr>
+        <w:keepLines w:val="0"/>
+        <w:spacing w:after="0" w:before="0" w:line="20" w:lineRule="exact"/>
+      </w:pPr>
+      <w:r>
+        <w:rPr>
+          <w:sz w:val="2"/>
+        </w:rPr>
+        <w:br w:type="page"/>
+      </w:r>
+    </w:p>
+    <w:p>
+      <w:pPr>
+        <w:pStyle w:val="Title"/>
+        <w:keepLines/>
+      </w:pPr>
+      <w:r>
+        <w:t>참가자 지연과 개인전 UI 수정</w:t>
+      </w:r>
+    </w:p>
+    <w:p>
+      <w:pPr>
+        <w:pStyle w:val="Case2Body"/>
+        <w:keepLines/>
+      </w:pPr>
+      <w:r>
+        <w:t>2026년 10월 16일  |  사례 02  |  요청 R05부터 R09</w:t>
+      </w:r>
+    </w:p>
+    <w:p>
+      <w:pPr>
+        <w:pStyle w:val="Case2Body"/>
+        <w:keepLines/>
+      </w:pPr>
+      <w:r>
+        <w:t>내 로봇 초상화를 배정된 옷색에 맞추고, 1대1의 팀 문구와 A/B 점수 표시를 개인 점령과 플레이어 이름으로 바꿨다. 참가자의 서버 응답 대기 이동을 재현하고 로컬 예측과 서버 확인 후 보정을 적용했다. 같은 인위적 지연 조건에서 첫 이동이 약217ms 대기에서 입력을 처리한 같은 프레임으로 바뀌었다. 2대2의 팀 표시는 유지한다.</w:t>
+      </w:r>
+    </w:p>
+    <w:p>
+      <w:pPr>
+        <w:pStyle w:val="Case2Body"/>
+        <w:keepLines/>
+      </w:pPr>
+      <w:r>
+        <w:t>기존 노란 고정 PNG가 배정색을 읽지 않았고, 팀 문구도 1대1을 구분하지 않았다.</w:t>
+      </w:r>
+    </w:p>
+    <w:p>
+      <w:pPr>
+        <w:keepLines/>
+        <w:spacing w:after="40"/>
+        <w:jc w:val="center"/>
+      </w:pPr>
+      <w:r>
+        <w:drawing>
+          <wp:inline xmlns:a="http://schemas.openxmlformats.org/drawingml/2006/main" xmlns:pic="http://schemas.openxmlformats.org/drawingml/2006/picture">
+            <wp:extent cx="6035040" cy="3394710"/>
+            <wp:docPr id="5" name="Picture 5"/>
+            <wp:cNvGraphicFramePr>
+              <a:graphicFrameLocks noChangeAspect="1"/>
+            </wp:cNvGraphicFramePr>
+            <a:graphic>
+              <a:graphicData uri="http://schemas.openxmlformats.org/drawingml/2006/picture">
+                <pic:pic>
+                  <pic:nvPicPr>
+                    <pic:cNvPr id="0" name="20261016_latency_client_before.png"/>
+                    <pic:cNvPicPr/>
+                  </pic:nvPicPr>
+                  <pic:blipFill>
+                    <a:blip r:embed="rId13"/>
+                    <a:stretch>
+                      <a:fillRect/>
+                    </a:stretch>
+                  </pic:blipFill>
+                  <pic:spPr>
+                    <a:xfrm>
+                      <a:off x="0" y="0"/>
+                      <a:ext cx="6035040" cy="3394710"/>
+                    </a:xfrm>
+                    <a:prstGeom prst="rect"/>
+                  </pic:spPr>
+                </pic:pic>
+              </a:graphicData>
+            </a:graphic>
+          </wp:inline>
+        </w:drawing>
+      </w:r>
+    </w:p>
+    <w:p>
+      <w:pPr>
+        <w:pStyle w:val="Caption"/>
+        <w:keepLines/>
+      </w:pPr>
+      <w:r>
+        <w:t>2026-10-16 수정 전 실제 참가자 화면. 노란 고정 초상화와 팀 문구, 인위적 지연 검수용 패널이 보인다. 패널 수치는 촬영 시점의 진행 중 값이다.</w:t>
+      </w:r>
+    </w:p>
+    <w:tbl>
+      <w:tblPr>
+        <w:tblW w:type="auto" w:w="0"/>
+        <w:tblLayout w:type="fixed"/>
+        <w:tblLook w:firstColumn="1" w:firstRow="1" w:lastColumn="0" w:lastRow="0" w:noHBand="0" w:noVBand="1" w:val="04A0"/>
+      </w:tblPr>
+      <w:tblGrid>
+        <w:gridCol w:w="3298"/>
+        <w:gridCol w:w="3298"/>
+        <w:gridCol w:w="3298"/>
+      </w:tblGrid>
+      <w:tr>
+        <w:tc>
+          <w:tcPr>
+            <w:tcW w:type="dxa" w:w="3888"/>
+            <w:tcBorders>
+              <w:top w:val="single" w:sz="4" w:color="D9D9D9"/>
+              <w:left w:val="single" w:sz="4" w:color="D9D9D9"/>
+              <w:bottom w:val="single" w:sz="4" w:color="D9D9D9"/>
+              <w:right w:val="single" w:sz="4" w:color="D9D9D9"/>
+            </w:tcBorders>
+            <w:shd w:fill="E5EAF0"/>
+          </w:tcPr>
+          <w:p>
+            <w:pPr>
+              <w:spacing w:after="100" w:before="100"/>
+            </w:pPr>
+            <w:r>
+              <w:rPr>
+                <w:b/>
+                <w:color w:val="000000"/>
+                <w:sz w:val="20"/>
+              </w:rPr>
+              <w:t>측정 항목</w:t>
+            </w:r>
+          </w:p>
+        </w:tc>
+        <w:tc>
+          <w:tcPr>
+            <w:tcW w:type="dxa" w:w="2592"/>
+            <w:tcBorders>
+              <w:top w:val="single" w:sz="4" w:color="D9D9D9"/>
+              <w:left w:val="single" w:sz="4" w:color="D9D9D9"/>
+              <w:bottom w:val="single" w:sz="4" w:color="D9D9D9"/>
+              <w:right w:val="single" w:sz="4" w:color="D9D9D9"/>
+            </w:tcBorders>
+            <w:shd w:fill="E5EAF0"/>
+          </w:tcPr>
+          <w:p>
+            <w:pPr>
+              <w:spacing w:after="100" w:before="100"/>
+            </w:pPr>
+            <w:r>
+              <w:rPr>
+                <w:b/>
+                <w:color w:val="000000"/>
+                <w:sz w:val="20"/>
+              </w:rPr>
+              <w:t>수정 전</w:t>
+            </w:r>
+          </w:p>
+        </w:tc>
+        <w:tc>
+          <w:tcPr>
+            <w:tcW w:type="dxa" w:w="3024"/>
+            <w:tcBorders>
+              <w:top w:val="single" w:sz="4" w:color="D9D9D9"/>
+              <w:left w:val="single" w:sz="4" w:color="D9D9D9"/>
+              <w:bottom w:val="single" w:sz="4" w:color="D9D9D9"/>
+              <w:right w:val="single" w:sz="4" w:color="D9D9D9"/>
+            </w:tcBorders>
+            <w:shd w:fill="E5EAF0"/>
+          </w:tcPr>
+          <w:p>
+            <w:pPr>
+              <w:spacing w:after="100" w:before="100"/>
+            </w:pPr>
+            <w:r>
+              <w:rPr>
+                <w:b/>
+                <w:color w:val="000000"/>
+                <w:sz w:val="20"/>
+              </w:rPr>
+              <w:t>수정 후</w:t>
+            </w:r>
+          </w:p>
+        </w:tc>
+      </w:tr>
+      <w:tr>
+        <w:tc>
+          <w:tcPr>
+            <w:tcW w:type="dxa" w:w="3888"/>
+            <w:tcBorders>
+              <w:top w:val="single" w:sz="4" w:color="D9D9D9"/>
+              <w:left w:val="single" w:sz="4" w:color="D9D9D9"/>
+              <w:bottom w:val="single" w:sz="4" w:color="D9D9D9"/>
+              <w:right w:val="single" w:sz="4" w:color="D9D9D9"/>
+            </w:tcBorders>
+          </w:tcPr>
+          <w:p>
+            <w:pPr>
+              <w:spacing w:after="100" w:before="100"/>
+            </w:pPr>
+            <w:r>
+              <w:rPr>
+                <w:b w:val="0"/>
+                <w:color w:val="000000"/>
+                <w:sz w:val="20"/>
+              </w:rPr>
+              <w:t>참가자 첫 로컬 이동</w:t>
+            </w:r>
+          </w:p>
+        </w:tc>
+        <w:tc>
+          <w:tcPr>
+            <w:tcW w:type="dxa" w:w="2592"/>
+            <w:tcBorders>
+              <w:top w:val="single" w:sz="4" w:color="D9D9D9"/>
+              <w:left w:val="single" w:sz="4" w:color="D9D9D9"/>
+              <w:bottom w:val="single" w:sz="4" w:color="D9D9D9"/>
+              <w:right w:val="single" w:sz="4" w:color="D9D9D9"/>
+            </w:tcBorders>
+          </w:tcPr>
+          <w:p>
+            <w:pPr>
+              <w:spacing w:after="100" w:before="100"/>
+            </w:pPr>
+            <w:r>
+              <w:rPr>
+                <w:b w:val="0"/>
+                <w:color w:val="000000"/>
+                <w:sz w:val="20"/>
+              </w:rPr>
+              <w:t>217.40ms</w:t>
+            </w:r>
+          </w:p>
+        </w:tc>
+        <w:tc>
+          <w:tcPr>
+            <w:tcW w:type="dxa" w:w="3024"/>
+            <w:tcBorders>
+              <w:top w:val="single" w:sz="4" w:color="D9D9D9"/>
+              <w:left w:val="single" w:sz="4" w:color="D9D9D9"/>
+              <w:bottom w:val="single" w:sz="4" w:color="D9D9D9"/>
+              <w:right w:val="single" w:sz="4" w:color="D9D9D9"/>
+            </w:tcBorders>
+          </w:tcPr>
+          <w:p>
+            <w:pPr>
+              <w:spacing w:after="100" w:before="100"/>
+            </w:pPr>
+            <w:r>
+              <w:rPr>
+                <w:b w:val="0"/>
+                <w:color w:val="000000"/>
+                <w:sz w:val="20"/>
+              </w:rPr>
+              <w:t>같은 프레임 0.13ms</w:t>
+            </w:r>
+          </w:p>
+        </w:tc>
+      </w:tr>
+      <w:tr>
+        <w:tc>
+          <w:tcPr>
+            <w:tcW w:type="dxa" w:w="3888"/>
+            <w:tcBorders>
+              <w:top w:val="single" w:sz="4" w:color="D9D9D9"/>
+              <w:left w:val="single" w:sz="4" w:color="D9D9D9"/>
+              <w:bottom w:val="single" w:sz="4" w:color="D9D9D9"/>
+              <w:right w:val="single" w:sz="4" w:color="D9D9D9"/>
+            </w:tcBorders>
+          </w:tcPr>
+          <w:p>
+            <w:pPr>
+              <w:spacing w:after="100" w:before="100"/>
+            </w:pPr>
+            <w:r>
+              <w:rPr>
+                <w:b w:val="0"/>
+                <w:color w:val="000000"/>
+                <w:sz w:val="20"/>
+              </w:rPr>
+              <w:t>전진 중 위치 정지 프레임</w:t>
+            </w:r>
+          </w:p>
+        </w:tc>
+        <w:tc>
+          <w:tcPr>
+            <w:tcW w:type="dxa" w:w="2592"/>
+            <w:tcBorders>
+              <w:top w:val="single" w:sz="4" w:color="D9D9D9"/>
+              <w:left w:val="single" w:sz="4" w:color="D9D9D9"/>
+              <w:bottom w:val="single" w:sz="4" w:color="D9D9D9"/>
+              <w:right w:val="single" w:sz="4" w:color="D9D9D9"/>
+            </w:tcBorders>
+          </w:tcPr>
+          <w:p>
+            <w:pPr>
+              <w:spacing w:after="100" w:before="100"/>
+            </w:pPr>
+            <w:r>
+              <w:rPr>
+                <w:b w:val="0"/>
+                <w:color w:val="000000"/>
+                <w:sz w:val="20"/>
+              </w:rPr>
+              <w:t>57 / 83</w:t>
+            </w:r>
+          </w:p>
+        </w:tc>
+        <w:tc>
+          <w:tcPr>
+            <w:tcW w:type="dxa" w:w="3024"/>
+            <w:tcBorders>
+              <w:top w:val="single" w:sz="4" w:color="D9D9D9"/>
+              <w:left w:val="single" w:sz="4" w:color="D9D9D9"/>
+              <w:bottom w:val="single" w:sz="4" w:color="D9D9D9"/>
+              <w:right w:val="single" w:sz="4" w:color="D9D9D9"/>
+            </w:tcBorders>
+          </w:tcPr>
+          <w:p>
+            <w:pPr>
+              <w:spacing w:after="100" w:before="100"/>
+            </w:pPr>
+            <w:r>
+              <w:rPr>
+                <w:b w:val="0"/>
+                <w:color w:val="000000"/>
+                <w:sz w:val="20"/>
+              </w:rPr>
+              <w:t>0 / 83</w:t>
+            </w:r>
+          </w:p>
+        </w:tc>
+      </w:tr>
+      <w:tr>
+        <w:tc>
+          <w:tcPr>
+            <w:tcW w:type="dxa" w:w="3888"/>
+            <w:tcBorders>
+              <w:top w:val="single" w:sz="4" w:color="D9D9D9"/>
+              <w:left w:val="single" w:sz="4" w:color="D9D9D9"/>
+              <w:bottom w:val="single" w:sz="4" w:color="D9D9D9"/>
+              <w:right w:val="single" w:sz="4" w:color="D9D9D9"/>
+            </w:tcBorders>
+          </w:tcPr>
+          <w:p>
+            <w:pPr>
+              <w:spacing w:after="100" w:before="100"/>
+            </w:pPr>
+            <w:r>
+              <w:rPr>
+                <w:b w:val="0"/>
+                <w:color w:val="000000"/>
+                <w:sz w:val="20"/>
+              </w:rPr>
+              <w:t>참가자 평균 프레임 시간</w:t>
+            </w:r>
+          </w:p>
+        </w:tc>
+        <w:tc>
+          <w:tcPr>
+            <w:tcW w:type="dxa" w:w="2592"/>
+            <w:tcBorders>
+              <w:top w:val="single" w:sz="4" w:color="D9D9D9"/>
+              <w:left w:val="single" w:sz="4" w:color="D9D9D9"/>
+              <w:bottom w:val="single" w:sz="4" w:color="D9D9D9"/>
+              <w:right w:val="single" w:sz="4" w:color="D9D9D9"/>
+            </w:tcBorders>
+          </w:tcPr>
+          <w:p>
+            <w:pPr>
+              <w:spacing w:after="100" w:before="100"/>
+            </w:pPr>
+            <w:r>
+              <w:rPr>
+                <w:b w:val="0"/>
+                <w:color w:val="000000"/>
+                <w:sz w:val="20"/>
+              </w:rPr>
+              <w:t>16.71ms</w:t>
+            </w:r>
+          </w:p>
+        </w:tc>
+        <w:tc>
+          <w:tcPr>
+            <w:tcW w:type="dxa" w:w="3024"/>
+            <w:tcBorders>
+              <w:top w:val="single" w:sz="4" w:color="D9D9D9"/>
+              <w:left w:val="single" w:sz="4" w:color="D9D9D9"/>
+              <w:bottom w:val="single" w:sz="4" w:color="D9D9D9"/>
+              <w:right w:val="single" w:sz="4" w:color="D9D9D9"/>
+            </w:tcBorders>
+          </w:tcPr>
+          <w:p>
+            <w:pPr>
+              <w:spacing w:after="100" w:before="100"/>
+            </w:pPr>
+            <w:r>
+              <w:rPr>
+                <w:b w:val="0"/>
+                <w:color w:val="000000"/>
+                <w:sz w:val="20"/>
+              </w:rPr>
+              <w:t>16.71ms</w:t>
+            </w:r>
+          </w:p>
+        </w:tc>
+      </w:tr>
+      <w:tr>
+        <w:tc>
+          <w:tcPr>
+            <w:tcW w:type="dxa" w:w="3888"/>
+            <w:tcBorders>
+              <w:top w:val="single" w:sz="4" w:color="D9D9D9"/>
+              <w:left w:val="single" w:sz="4" w:color="D9D9D9"/>
+              <w:bottom w:val="single" w:sz="4" w:color="D9D9D9"/>
+              <w:right w:val="single" w:sz="4" w:color="D9D9D9"/>
+            </w:tcBorders>
+          </w:tcPr>
+          <w:p>
+            <w:pPr>
+              <w:spacing w:after="100" w:before="100"/>
+            </w:pPr>
+            <w:r>
+              <w:rPr>
+                <w:b w:val="0"/>
+                <w:color w:val="000000"/>
+                <w:sz w:val="20"/>
+              </w:rPr>
+              <w:t>방장 누적 송신 페이로드</w:t>
+            </w:r>
+          </w:p>
+        </w:tc>
+        <w:tc>
+          <w:tcPr>
+            <w:tcW w:type="dxa" w:w="2592"/>
+            <w:tcBorders>
+              <w:top w:val="single" w:sz="4" w:color="D9D9D9"/>
+              <w:left w:val="single" w:sz="4" w:color="D9D9D9"/>
+              <w:bottom w:val="single" w:sz="4" w:color="D9D9D9"/>
+              <w:right w:val="single" w:sz="4" w:color="D9D9D9"/>
+            </w:tcBorders>
+          </w:tcPr>
+          <w:p>
+            <w:pPr>
+              <w:spacing w:after="100" w:before="100"/>
+            </w:pPr>
+            <w:r>
+              <w:rPr>
+                <w:b w:val="0"/>
+                <w:color w:val="000000"/>
+                <w:sz w:val="20"/>
+              </w:rPr>
+              <w:t>750,342바이트</w:t>
+            </w:r>
+          </w:p>
+        </w:tc>
+        <w:tc>
+          <w:tcPr>
+            <w:tcW w:type="dxa" w:w="3024"/>
+            <w:tcBorders>
+              <w:top w:val="single" w:sz="4" w:color="D9D9D9"/>
+              <w:left w:val="single" w:sz="4" w:color="D9D9D9"/>
+              <w:bottom w:val="single" w:sz="4" w:color="D9D9D9"/>
+              <w:right w:val="single" w:sz="4" w:color="D9D9D9"/>
+            </w:tcBorders>
+          </w:tcPr>
+          <w:p>
+            <w:pPr>
+              <w:spacing w:after="100" w:before="100"/>
+            </w:pPr>
+            <w:r>
+              <w:rPr>
+                <w:b w:val="0"/>
+                <w:color w:val="000000"/>
+                <w:sz w:val="20"/>
+              </w:rPr>
+              <w:t>132,314바이트</w:t>
+            </w:r>
+          </w:p>
+        </w:tc>
+      </w:tr>
+    </w:tbl>
+    <w:p>
+      <w:pPr>
+        <w:pStyle w:val="Case2Body"/>
+        <w:keepLines/>
+      </w:pPr>
+      <w:r>
+        <w:t>측정은2026-10-16, 같은 PC의 Windows 네이티브 게임2개, D3D11 일반 창,960×540, 목표60fps 조건이다. 양방향 송신에60ms씩 지연을 넣었으며 실제 WAN 측정이 아니다. 첫 반응은 자동 입력 할당부터 로컬 물리 위치 변경까지의 앱 내부 시간이다. 하드웨어 입력부터 화면 표시까지의 시간이나 ping이 아니다. 같은 프레임 반영은60fps에서 다음 표시 프레임 약16.7ms 안에 보이는 범위로 해석한다.</w:t>
+      </w:r>
+    </w:p>
+    <w:p>
+      <w:pPr>
+        <w:keepLines w:val="0"/>
+        <w:spacing w:after="0" w:before="0" w:line="20" w:lineRule="exact"/>
+      </w:pPr>
+      <w:r>
+        <w:rPr>
+          <w:sz w:val="2"/>
+        </w:rPr>
+        <w:br w:type="page"/>
+      </w:r>
+    </w:p>
+    <w:p>
+      <w:pPr>
+        <w:pStyle w:val="Heading1"/>
+        <w:keepLines/>
+      </w:pPr>
+      <w:r>
+        <w:t>원인 확인과 수정 방법</w:t>
+      </w:r>
+    </w:p>
+    <w:p>
+      <w:pPr>
+        <w:pStyle w:val="Case2Body"/>
+        <w:keepLines/>
+      </w:pPr>
+      <w:r>
+        <w:t>이동 경로를 추적하면 방장은 입력을 매 프레임 직접 처리하지만 참가자는 약20Hz로 입력을 보내고, 서버가 돌려준 위치를 수신할 때만 자기 CharacterController를 옮겼다. 50ms 전송 간격과 양방향 통신 대기, 스냅샷 갱신 간격이 합쳐져 입력 반응이 늦고 위치가 계단식으로 움직였다.</w:t>
+      </w:r>
+    </w:p>
+    <w:p>
+      <w:pPr>
+        <w:pStyle w:val="Case2Body"/>
+        <w:keepLines/>
+      </w:pPr>
+      <w:r>
+        <w:t>수정 전 일반 창으로 같은 PC의 실제 EXE 두 개를 연결하고, 입력과 위치 메시지 송신에 각각60ms 지연을 넣었다. 자동 전진 입력 후 참가자의 첫 이동은217.40ms, 방장은0.40ms였다. 참가자는 측정 구간83프레임 중57프레임에 같은 위치를 유지했다. 양쪽 프레임 시간은 약16.7ms여서 이 재현에서는 그래픽 프레임 부족보다 이동 동기화 대기가 원인으로 확인됐다.</w:t>
+      </w:r>
+    </w:p>
+    <w:p>
+      <w:pPr>
+        <w:pStyle w:val="Case2Body"/>
+        <w:keepLines/>
+      </w:pPr>
+      <w:r>
+        <w:t>위치 메시지도 ReliableFragmentedSequenced를 사용했다. 오래된 위치의 재전송을 기다릴 수 있는 추가 위험이 있는 구조다. 이번 수정 전 검사는 실제 전송 계층의 패킷 손실을 만들지는 않았으므로, 해당 재전송이 사용자가 겪은 지연을 얼마나 키웠는지는 미측정으로 구분한다.</w:t>
+      </w:r>
+    </w:p>
+    <w:p>
+      <w:pPr>
+        <w:keepLines/>
+        <w:spacing w:after="40"/>
+        <w:jc w:val="center"/>
+      </w:pPr>
+      <w:r>
+        <w:drawing>
+          <wp:inline xmlns:a="http://schemas.openxmlformats.org/drawingml/2006/main" xmlns:pic="http://schemas.openxmlformats.org/drawingml/2006/picture">
+            <wp:extent cx="5486400" cy="2081604"/>
+            <wp:docPr id="6" name="Picture 6"/>
+            <wp:cNvGraphicFramePr>
+              <a:graphicFrameLocks noChangeAspect="1"/>
+            </wp:cNvGraphicFramePr>
+            <a:graphic>
+              <a:graphicData uri="http://schemas.openxmlformats.org/drawingml/2006/picture">
+                <pic:pic>
+                  <pic:nvPicPr>
+                    <pic:cNvPr id="0" name="20261016_latency_movement_trace.png"/>
+                    <pic:cNvPicPr/>
+                  </pic:nvPicPr>
+                  <pic:blipFill>
+                    <a:blip r:embed="rId15"/>
+                    <a:stretch>
+                      <a:fillRect/>
+                    </a:stretch>
+                  </pic:blipFill>
+                  <pic:spPr>
+                    <a:xfrm>
+                      <a:off x="0" y="0"/>
+                      <a:ext cx="5486400" cy="2081604"/>
+                    </a:xfrm>
+                    <a:prstGeom prst="rect"/>
+                  </pic:spPr>
+                </pic:pic>
+              </a:graphicData>
+            </a:graphic>
+          </wp:inline>
+        </w:drawing>
+      </w:r>
+    </w:p>
+    <w:p>
+      <w:pPr>
+        <w:pStyle w:val="Caption"/>
+        <w:keepLines/>
+      </w:pPr>
+      <w:r>
+        <w:t>실제 프레임별 CSV로 그린 이동 거리. 빨강은 서버 응답 대기, 초록은 로컬 예측이다. 네트워크 지연을 없앴다는 뜻은 아니다.</w:t>
+      </w:r>
+    </w:p>
+    <w:p>
+      <w:pPr>
+        <w:pStyle w:val="Case2Body"/>
+        <w:keepLines/>
+      </w:pPr>
+      <w:r>
+        <w:t>서버 이동 계산을 SimulateNetMovement로 분리해 참가자도 같은 충돌·중력·웅크리기·대쉬 계산을60Hz로 먼저 실행한다. 입력에 순번을 붙이고, 서버가 확인한 순번까지 이력에서 지운 뒤 아직 확인되지 않은 입력만 다시 적용한다. 서버가 최종 위치·아이템·피격·점령을 계속 결정한다. 강제 이동 중에는 일반 로컬 이동 예측을 제한한다.</w:t>
+      </w:r>
+    </w:p>
+    <w:p>
+      <w:pPr>
+        <w:pStyle w:val="Case2Body"/>
+        <w:keepLines/>
+      </w:pPr>
+      <w:r>
+        <w:t>입력과 상태 전송은30Hz로 바꿨다. 확인 전 최근 입력을 묶어 재전송하고 중복 순번은 한 번만 처리한다. 프레임 순번은 방 수명 동안 증가시켜 오래된 상태를 거부하고, 다른 플레이어의 위치·회전은 프레임 사이에서 보간한다. 입력 이력·큐·처리 시간에는 상한을 둔다.</w:t>
+      </w:r>
+    </w:p>
+    <w:p>
+      <w:pPr>
+        <w:pStyle w:val="Case2Body"/>
+        <w:keepLines/>
+      </w:pPr>
+      <w:r>
+        <w:t>입력·스냅샷 JSON은 기본 제공 UTF8/Deflate로 압축한다. 압축 결과1,100바이트 이하는 UnreliableSequenced로 보내 최신 상태를 우선한다. 이보다 큰 데이터는 기존 신뢰성 있는 분할 전송으로 보낸다. 수신 압축 크기와64KiB 해제 크기를 제한했다. 색·우체통·택배는 상태가 바뀔 때만 다시 적용해 불필요한 갱신도 줄였다.</w:t>
+      </w:r>
+    </w:p>
+    <w:p>
+      <w:pPr>
+        <w:pStyle w:val="Case2Body"/>
+        <w:keepLines/>
+      </w:pPr>
+      <w:r>
+        <w:t>기존 네이티브 아이콘 렌더 도구로 자동 배정 색6종의 로봇 PNG를 만들고 배정 번호로 선택한다. 1대1은 점령/내 점령/플레이어 이름과 개인 색을 사용하고, 2대2는 우리 팀/A 팀/B 팀과 팀 점령색을 사용한다. 메시지 형식 변경을 구분하기 위해 NGO ProtocolVersion을3으로 올렸다.</w:t>
+      </w:r>
+    </w:p>
+    <w:p>
+      <w:pPr>
+        <w:keepLines w:val="0"/>
+        <w:spacing w:after="0" w:before="0" w:line="20" w:lineRule="exact"/>
+      </w:pPr>
+      <w:r>
+        <w:rPr>
+          <w:sz w:val="2"/>
+        </w:rPr>
+        <w:br w:type="page"/>
+      </w:r>
+    </w:p>
+    <w:p>
+      <w:pPr>
+        <w:pStyle w:val="Heading1"/>
+        <w:keepLines/>
+      </w:pPr>
+      <w:r>
+        <w:t>수정 후 개인전 화면</w:t>
+      </w:r>
+    </w:p>
+    <w:p>
+      <w:pPr>
+        <w:keepLines/>
+        <w:spacing w:after="40"/>
+        <w:jc w:val="center"/>
+      </w:pPr>
+      <w:r>
+        <w:drawing>
+          <wp:inline xmlns:a="http://schemas.openxmlformats.org/drawingml/2006/main" xmlns:pic="http://schemas.openxmlformats.org/drawingml/2006/picture">
+            <wp:extent cx="6035040" cy="3394710"/>
+            <wp:docPr id="7" name="Picture 7"/>
+            <wp:cNvGraphicFramePr>
+              <a:graphicFrameLocks noChangeAspect="1"/>
+            </wp:cNvGraphicFramePr>
+            <a:graphic>
+              <a:graphicData uri="http://schemas.openxmlformats.org/drawingml/2006/picture">
+                <pic:pic>
+                  <pic:nvPicPr>
+                    <pic:cNvPr id="0" name="20261016_latency_client_after.png"/>
+                    <pic:cNvPicPr/>
+                  </pic:nvPicPr>
+                  <pic:blipFill>
+                    <a:blip r:embed="rId16"/>
+                    <a:stretch>
+                      <a:fillRect/>
+                    </a:stretch>
+                  </pic:blipFill>
+                  <pic:spPr>
+                    <a:xfrm>
+                      <a:off x="0" y="0"/>
+                      <a:ext cx="6035040" cy="3394710"/>
+                    </a:xfrm>
+                    <a:prstGeom prst="rect"/>
+                  </pic:spPr>
+                </pic:pic>
+              </a:graphicData>
+            </a:graphic>
+          </wp:inline>
+        </w:drawing>
+      </w:r>
+    </w:p>
+    <w:p>
+      <w:pPr>
+        <w:pStyle w:val="Caption"/>
+        <w:keepLines/>
+      </w:pPr>
+      <w:r>
+        <w:t>2026-10-16 최종 수정 후 실제 참가자 화면. 배정된 초록 초상화, 개인 점령 문구, Host와 Guest 이름, 같은 프레임 반응을 확인했다.</w:t>
+      </w:r>
+    </w:p>
+    <w:p>
+      <w:pPr>
+        <w:pStyle w:val="Case2Body"/>
+        <w:keepLines/>
+      </w:pPr>
+      <w:r>
+        <w:t>수정 후 참가자 화면은 초록 옷 배정과 같은 초록 초상화를 보인다. 왼쪽 위는 점령, 왼쪽 이름은 나 · Guest, 미니맵은 내 점령, 위 가운데는 Host와 Guest다. 2대2 검수에서는 빨간 옷 방장의 초상화가 빨강이고 A/B 팀 점수가 유지된다. 화면의 검수용 측정 패널은 실행 인자로 켠 개발 검사에만 나타난다.</w:t>
+      </w:r>
+    </w:p>
+    <w:p>
+      <w:pPr>
+        <w:pStyle w:val="Heading2"/>
+        <w:keepLines/>
+      </w:pPr>
+      <w:r>
+        <w:t>메시지 누락과 위치 확인</w:t>
+      </w:r>
+    </w:p>
+    <w:p>
+      <w:pPr>
+        <w:pStyle w:val="Case2Body"/>
+        <w:keepLines/>
+      </w:pPr>
+      <w:r>
+        <w:t>추가 검사에서는 같은 지연 조건에서 송신 앱 메시지를 매5번째마다 누락했다. 실제 전송 계층 손실을 만든 검사는 아니다. 참가자 메시지32개를 의도적으로 누락한 상태에서도 전진 구간83프레임이 모두 움직였고, 정지 후 로컬 위치와 마지막 서버 확인 위치가 일치했다. 확인 전 입력은 다시 보내고 서버는 중복을 제거했다. 판정·상태 변화까지 네트워크 지연이 없어졌다는 의미는 아니다.</w:t>
+      </w:r>
+    </w:p>
+    <w:tbl>
+      <w:tblPr>
+        <w:tblW w:type="auto" w:w="0"/>
+        <w:tblLayout w:type="fixed"/>
+        <w:tblLook w:firstColumn="1" w:firstRow="1" w:lastColumn="0" w:lastRow="0" w:noHBand="0" w:noVBand="1" w:val="04A0"/>
+      </w:tblPr>
+      <w:tblGrid>
+        <w:gridCol w:w="4946"/>
+        <w:gridCol w:w="4946"/>
+      </w:tblGrid>
+      <w:tr>
+        <w:tc>
+          <w:tcPr>
+            <w:tcW w:type="dxa" w:w="3312"/>
+            <w:tcBorders>
+              <w:top w:val="single" w:sz="4" w:color="D9D9D9"/>
+              <w:left w:val="single" w:sz="4" w:color="D9D9D9"/>
+              <w:bottom w:val="single" w:sz="4" w:color="D9D9D9"/>
+              <w:right w:val="single" w:sz="4" w:color="D9D9D9"/>
+            </w:tcBorders>
+            <w:shd w:fill="E5EAF0"/>
+          </w:tcPr>
+          <w:p>
+            <w:pPr>
+              <w:spacing w:after="100" w:before="100"/>
+            </w:pPr>
+            <w:r>
+              <w:rPr>
+                <w:b/>
+                <w:color w:val="000000"/>
+                <w:sz w:val="20"/>
+              </w:rPr>
+              <w:t>검사</w:t>
+            </w:r>
+          </w:p>
+        </w:tc>
+        <w:tc>
+          <w:tcPr>
+            <w:tcW w:type="dxa" w:w="6192"/>
+            <w:tcBorders>
+              <w:top w:val="single" w:sz="4" w:color="D9D9D9"/>
+              <w:left w:val="single" w:sz="4" w:color="D9D9D9"/>
+              <w:bottom w:val="single" w:sz="4" w:color="D9D9D9"/>
+              <w:right w:val="single" w:sz="4" w:color="D9D9D9"/>
+            </w:tcBorders>
+            <w:shd w:fill="E5EAF0"/>
+          </w:tcPr>
+          <w:p>
+            <w:pPr>
+              <w:spacing w:after="100" w:before="100"/>
+            </w:pPr>
+            <w:r>
+              <w:rPr>
+                <w:b/>
+                <w:color w:val="000000"/>
+                <w:sz w:val="20"/>
+              </w:rPr>
+              <w:t>최종 결과</w:t>
+            </w:r>
+          </w:p>
+        </w:tc>
+      </w:tr>
+      <w:tr>
+        <w:tc>
+          <w:tcPr>
+            <w:tcW w:type="dxa" w:w="3312"/>
+            <w:tcBorders>
+              <w:top w:val="single" w:sz="4" w:color="D9D9D9"/>
+              <w:left w:val="single" w:sz="4" w:color="D9D9D9"/>
+              <w:bottom w:val="single" w:sz="4" w:color="D9D9D9"/>
+              <w:right w:val="single" w:sz="4" w:color="D9D9D9"/>
+            </w:tcBorders>
+          </w:tcPr>
+          <w:p>
+            <w:pPr>
+              <w:spacing w:after="100" w:before="100"/>
+            </w:pPr>
+            <w:r>
+              <w:rPr>
+                <w:b w:val="0"/>
+                <w:color w:val="000000"/>
+                <w:sz w:val="20"/>
+              </w:rPr>
+              <w:t>Editor 예측과 HUD</w:t>
+            </w:r>
+          </w:p>
+        </w:tc>
+        <w:tc>
+          <w:tcPr>
+            <w:tcW w:type="dxa" w:w="6192"/>
+            <w:tcBorders>
+              <w:top w:val="single" w:sz="4" w:color="D9D9D9"/>
+              <w:left w:val="single" w:sz="4" w:color="D9D9D9"/>
+              <w:bottom w:val="single" w:sz="4" w:color="D9D9D9"/>
+              <w:right w:val="single" w:sz="4" w:color="D9D9D9"/>
+            </w:tcBorders>
+          </w:tcPr>
+          <w:p>
+            <w:pPr>
+              <w:spacing w:after="100" w:before="100"/>
+            </w:pPr>
+            <w:r>
+              <w:rPr>
+                <w:b w:val="0"/>
+                <w:color w:val="000000"/>
+                <w:sz w:val="20"/>
+              </w:rPr>
+              <w:t>18개 통과 · 입력 순번/확인 후 재적용/새 판 순번/색6종/개인전·팀전/압축 한도</w:t>
+            </w:r>
+          </w:p>
+        </w:tc>
+      </w:tr>
+      <w:tr>
+        <w:tc>
+          <w:tcPr>
+            <w:tcW w:type="dxa" w:w="3312"/>
+            <w:tcBorders>
+              <w:top w:val="single" w:sz="4" w:color="D9D9D9"/>
+              <w:left w:val="single" w:sz="4" w:color="D9D9D9"/>
+              <w:bottom w:val="single" w:sz="4" w:color="D9D9D9"/>
+              <w:right w:val="single" w:sz="4" w:color="D9D9D9"/>
+            </w:tcBorders>
+          </w:tcPr>
+          <w:p>
+            <w:pPr>
+              <w:spacing w:after="100" w:before="100"/>
+            </w:pPr>
+            <w:r>
+              <w:rPr>
+                <w:b w:val="0"/>
+                <w:color w:val="000000"/>
+                <w:sz w:val="20"/>
+              </w:rPr>
+              <w:t>택배 풀 회귀</w:t>
+            </w:r>
+          </w:p>
+        </w:tc>
+        <w:tc>
+          <w:tcPr>
+            <w:tcW w:type="dxa" w:w="6192"/>
+            <w:tcBorders>
+              <w:top w:val="single" w:sz="4" w:color="D9D9D9"/>
+              <w:left w:val="single" w:sz="4" w:color="D9D9D9"/>
+              <w:bottom w:val="single" w:sz="4" w:color="D9D9D9"/>
+              <w:right w:val="single" w:sz="4" w:color="D9D9D9"/>
+            </w:tcBorders>
+          </w:tcPr>
+          <w:p>
+            <w:pPr>
+              <w:spacing w:after="100" w:before="100"/>
+            </w:pPr>
+            <w:r>
+              <w:rPr>
+                <w:b w:val="0"/>
+                <w:color w:val="000000"/>
+                <w:sz w:val="20"/>
+              </w:rPr>
+              <w:t>기존19개 재실행 통과 · 결과와 재촬영본은 별도 이름으로 보존</w:t>
+            </w:r>
+          </w:p>
+        </w:tc>
+      </w:tr>
+    </w:tbl>
+    <w:p>
+      <w:pPr>
+        <w:pStyle w:val="Heading2"/>
+        <w:keepLines/>
+      </w:pPr>
+      <w:r>
+        <w:t>재시도와 수정 이력</w:t>
+      </w:r>
+    </w:p>
+    <w:p>
+      <w:pPr>
+        <w:pStyle w:val="Case2Body"/>
+        <w:keepLines/>
+      </w:pPr>
+      <w:r>
+        <w:t>첫 숨김 창 캡처는 검게 나와 D3D11 일반 창으로 다시 촬영했다. CompressionLevel 이름 충돌은 전체 네임스페이스를 지정해 컴파일을 복구했다. 첫 수정본은 라운드에서 메시지 순번까지 초기화해 참가자 경기 진입이 늦어졌고 측정 저장 전에 방장이 종료됐다. 새 방에서만 순번을 초기화하도록 수정하고 재경기 순번 검사와 최종 양측 결과 저장으로 재검증했다. 실패 로그와 첫 화면은 삭제하지 않고 evidence/latency에 보존했다.</w:t>
+      </w:r>
+    </w:p>
+    <w:p>
+      <w:pPr>
+        <w:keepLines w:val="0"/>
+        <w:spacing w:after="0" w:before="0" w:line="20" w:lineRule="exact"/>
+      </w:pPr>
+      <w:r>
+        <w:rPr>
+          <w:sz w:val="2"/>
+        </w:rPr>
+        <w:br w:type="page"/>
+      </w:r>
+    </w:p>
+    <w:p>
+      <w:pPr>
+        <w:pStyle w:val="Heading1"/>
+        <w:keepLines/>
+      </w:pPr>
+      <w:r>
+        <w:t>팀 경기 회귀와 새 실행 파일</w:t>
+      </w:r>
+    </w:p>
+    <w:p>
+      <w:pPr>
+        <w:keepLines/>
+        <w:spacing w:after="40"/>
+        <w:jc w:val="center"/>
+      </w:pPr>
+      <w:r>
+        <w:drawing>
+          <wp:inline xmlns:a="http://schemas.openxmlformats.org/drawingml/2006/main" xmlns:pic="http://schemas.openxmlformats.org/drawingml/2006/picture">
+            <wp:extent cx="6035040" cy="3394710"/>
+            <wp:docPr id="8" name="Picture 8"/>
+            <wp:cNvGraphicFramePr>
+              <a:graphicFrameLocks noChangeAspect="1"/>
+            </wp:cNvGraphicFramePr>
+            <a:graphic>
+              <a:graphicData uri="http://schemas.openxmlformats.org/drawingml/2006/picture">
+                <pic:pic>
+                  <pic:nvPicPr>
+                    <pic:cNvPr id="0" name="20261016_ui_fix_network-gameplay.png"/>
+                    <pic:cNvPicPr/>
+                  </pic:nvPicPr>
+                  <pic:blipFill>
+                    <a:blip r:embed="rId17"/>
+                    <a:stretch>
+                      <a:fillRect/>
+                    </a:stretch>
+                  </pic:blipFill>
+                  <pic:spPr>
+                    <a:xfrm>
+                      <a:off x="0" y="0"/>
+                      <a:ext cx="6035040" cy="3394710"/>
+                    </a:xfrm>
+                    <a:prstGeom prst="rect"/>
+                  </pic:spPr>
+                </pic:pic>
+              </a:graphicData>
+            </a:graphic>
+          </wp:inline>
+        </w:drawing>
+      </w:r>
+    </w:p>
+    <w:p>
+      <w:pPr>
+        <w:pStyle w:val="Caption"/>
+        <w:keepLines/>
+      </w:pPr>
+      <w:r>
+        <w:t>2026-10-16 최종 EXE4개를 연결한 실제2대2 검수. 방장 초상화는 배정된 빨강, 점수는 팀 기준으로 유지된다.</w:t>
+      </w:r>
+    </w:p>
+    <w:tbl>
+      <w:tblPr>
+        <w:tblW w:type="auto" w:w="0"/>
+        <w:tblLayout w:type="fixed"/>
+        <w:tblLook w:firstColumn="1" w:firstRow="1" w:lastColumn="0" w:lastRow="0" w:noHBand="0" w:noVBand="1" w:val="04A0"/>
+      </w:tblPr>
+      <w:tblGrid>
+        <w:gridCol w:w="4946"/>
+        <w:gridCol w:w="4946"/>
+      </w:tblGrid>
+      <w:tr>
+        <w:tc>
+          <w:tcPr>
+            <w:tcW w:type="dxa" w:w="3312"/>
+            <w:tcBorders>
+              <w:top w:val="single" w:sz="4" w:color="D9D9D9"/>
+              <w:left w:val="single" w:sz="4" w:color="D9D9D9"/>
+              <w:bottom w:val="single" w:sz="4" w:color="D9D9D9"/>
+              <w:right w:val="single" w:sz="4" w:color="D9D9D9"/>
+            </w:tcBorders>
+            <w:shd w:fill="E5EAF0"/>
+          </w:tcPr>
+          <w:p>
+            <w:pPr>
+              <w:spacing w:after="100" w:before="100"/>
+            </w:pPr>
+            <w:r>
+              <w:rPr>
+                <w:b/>
+                <w:color w:val="000000"/>
+                <w:sz w:val="20"/>
+              </w:rPr>
+              <w:t>실행 검사</w:t>
+            </w:r>
+          </w:p>
+        </w:tc>
+        <w:tc>
+          <w:tcPr>
+            <w:tcW w:type="dxa" w:w="6192"/>
+            <w:tcBorders>
+              <w:top w:val="single" w:sz="4" w:color="D9D9D9"/>
+              <w:left w:val="single" w:sz="4" w:color="D9D9D9"/>
+              <w:bottom w:val="single" w:sz="4" w:color="D9D9D9"/>
+              <w:right w:val="single" w:sz="4" w:color="D9D9D9"/>
+            </w:tcBorders>
+            <w:shd w:fill="E5EAF0"/>
+          </w:tcPr>
+          <w:p>
+            <w:pPr>
+              <w:spacing w:after="100" w:before="100"/>
+            </w:pPr>
+            <w:r>
+              <w:rPr>
+                <w:b/>
+                <w:color w:val="000000"/>
+                <w:sz w:val="20"/>
+              </w:rPr>
+              <w:t>최종 결과</w:t>
+            </w:r>
+          </w:p>
+        </w:tc>
+      </w:tr>
+      <w:tr>
+        <w:tc>
+          <w:tcPr>
+            <w:tcW w:type="dxa" w:w="3312"/>
+            <w:tcBorders>
+              <w:top w:val="single" w:sz="4" w:color="D9D9D9"/>
+              <w:left w:val="single" w:sz="4" w:color="D9D9D9"/>
+              <w:bottom w:val="single" w:sz="4" w:color="D9D9D9"/>
+              <w:right w:val="single" w:sz="4" w:color="D9D9D9"/>
+            </w:tcBorders>
+          </w:tcPr>
+          <w:p>
+            <w:pPr>
+              <w:spacing w:after="100" w:before="100"/>
+            </w:pPr>
+            <w:r>
+              <w:rPr>
+                <w:b w:val="0"/>
+                <w:color w:val="000000"/>
+                <w:sz w:val="20"/>
+              </w:rPr>
+              <w:t>최종 EXE 1대1</w:t>
+            </w:r>
+          </w:p>
+        </w:tc>
+        <w:tc>
+          <w:tcPr>
+            <w:tcW w:type="dxa" w:w="6192"/>
+            <w:tcBorders>
+              <w:top w:val="single" w:sz="4" w:color="D9D9D9"/>
+              <w:left w:val="single" w:sz="4" w:color="D9D9D9"/>
+              <w:bottom w:val="single" w:sz="4" w:color="D9D9D9"/>
+              <w:right w:val="single" w:sz="4" w:color="D9D9D9"/>
+            </w:tcBorders>
+          </w:tcPr>
+          <w:p>
+            <w:pPr>
+              <w:spacing w:after="100" w:before="100"/>
+            </w:pPr>
+            <w:r>
+              <w:rPr>
+                <w:b w:val="0"/>
+                <w:color w:val="000000"/>
+                <w:sz w:val="20"/>
+              </w:rPr>
+              <w:t>호스트17 / 참가자5 통과</w:t>
+            </w:r>
+          </w:p>
+        </w:tc>
+      </w:tr>
+      <w:tr>
+        <w:tc>
+          <w:tcPr>
+            <w:tcW w:type="dxa" w:w="3312"/>
+            <w:tcBorders>
+              <w:top w:val="single" w:sz="4" w:color="D9D9D9"/>
+              <w:left w:val="single" w:sz="4" w:color="D9D9D9"/>
+              <w:bottom w:val="single" w:sz="4" w:color="D9D9D9"/>
+              <w:right w:val="single" w:sz="4" w:color="D9D9D9"/>
+            </w:tcBorders>
+          </w:tcPr>
+          <w:p>
+            <w:pPr>
+              <w:spacing w:after="100" w:before="100"/>
+            </w:pPr>
+            <w:r>
+              <w:rPr>
+                <w:b w:val="0"/>
+                <w:color w:val="000000"/>
+                <w:sz w:val="20"/>
+              </w:rPr>
+              <w:t>최종 EXE 2대2</w:t>
+            </w:r>
+          </w:p>
+        </w:tc>
+        <w:tc>
+          <w:tcPr>
+            <w:tcW w:type="dxa" w:w="6192"/>
+            <w:tcBorders>
+              <w:top w:val="single" w:sz="4" w:color="D9D9D9"/>
+              <w:left w:val="single" w:sz="4" w:color="D9D9D9"/>
+              <w:bottom w:val="single" w:sz="4" w:color="D9D9D9"/>
+              <w:right w:val="single" w:sz="4" w:color="D9D9D9"/>
+            </w:tcBorders>
+          </w:tcPr>
+          <w:p>
+            <w:pPr>
+              <w:spacing w:after="100" w:before="100"/>
+            </w:pPr>
+            <w:r>
+              <w:rPr>
+                <w:b w:val="0"/>
+                <w:color w:val="000000"/>
+                <w:sz w:val="20"/>
+              </w:rPr>
+              <w:t>호스트18 / 참가자 각5 통과</w:t>
+            </w:r>
+          </w:p>
+        </w:tc>
+      </w:tr>
+      <w:tr>
+        <w:tc>
+          <w:tcPr>
+            <w:tcW w:type="dxa" w:w="3312"/>
+            <w:tcBorders>
+              <w:top w:val="single" w:sz="4" w:color="D9D9D9"/>
+              <w:left w:val="single" w:sz="4" w:color="D9D9D9"/>
+              <w:bottom w:val="single" w:sz="4" w:color="D9D9D9"/>
+              <w:right w:val="single" w:sz="4" w:color="D9D9D9"/>
+            </w:tcBorders>
+          </w:tcPr>
+          <w:p>
+            <w:pPr>
+              <w:spacing w:after="100" w:before="100"/>
+            </w:pPr>
+            <w:r>
+              <w:rPr>
+                <w:b w:val="0"/>
+                <w:color w:val="000000"/>
+                <w:sz w:val="20"/>
+              </w:rPr>
+              <w:t>지연과 메시지 누락</w:t>
+            </w:r>
+          </w:p>
+        </w:tc>
+        <w:tc>
+          <w:tcPr>
+            <w:tcW w:type="dxa" w:w="6192"/>
+            <w:tcBorders>
+              <w:top w:val="single" w:sz="4" w:color="D9D9D9"/>
+              <w:left w:val="single" w:sz="4" w:color="D9D9D9"/>
+              <w:bottom w:val="single" w:sz="4" w:color="D9D9D9"/>
+              <w:right w:val="single" w:sz="4" w:color="D9D9D9"/>
+            </w:tcBorders>
+          </w:tcPr>
+          <w:p>
+            <w:pPr>
+              <w:spacing w:after="100" w:before="100"/>
+            </w:pPr>
+            <w:r>
+              <w:rPr>
+                <w:b w:val="0"/>
+                <w:color w:val="000000"/>
+                <w:sz w:val="20"/>
+              </w:rPr>
+              <w:t>첫 이동 반응/전진 중 정지 프레임/정지 후 위치 수렴 확인</w:t>
+            </w:r>
+          </w:p>
+        </w:tc>
+      </w:tr>
+    </w:tbl>
+    <w:p>
+      <w:pPr>
+        <w:pStyle w:val="Case2Body"/>
+        <w:keepLines/>
+      </w:pPr>
+      <w:r>
+        <w:t>최종 Windows x64 Mono Development LZ4 빌드 성공, 약263.39MB/13.57초. 기존 UnityPipeline CodeAnalysis Unsafe DLL 경로 진단1개와 Minimap 구형 API 경고2개는 그대로 기록했다. 이번 게임 코드의 컴파일 및 최종 EXE2개·4개 실행 검사는 통과했다.</w:t>
+      </w:r>
+    </w:p>
+    <w:p>
+      <w:pPr>
+        <w:pStyle w:val="Case2Body"/>
+        <w:keepLines/>
+      </w:pPr>
+      <w:r>
+        <w:t>MonsterDeliveryService_20261016_UI_NetworkFix.zip을 전체 압축 해제해 실행한다. 모든 참가자가 이 새 패키지를 사용해야 한다. Protocol3이며 이전 Protocol2와 혼용하지 않는다. EXE·Data·MonoBleedingEdge·DLL을 함께 유지한다. Test_1v1.cmd/Test_2v2.cmd를 포함한다.</w:t>
+      </w:r>
+    </w:p>
+    <w:p>
+      <w:pPr>
+        <w:pStyle w:val="Case2Body"/>
+        <w:keepLines/>
+      </w:pPr>
+      <w:r>
+        <w:t>서로 다른 물리 PC·실제 LAN/Tailscale/WAN의 프레임 시간과 지연은 아직 실측하지 않았다. 사용자의 실제 환경에서 추가 요인이 남는지는 새 버전 연결로 확인해야 한다.9종 전체 온라인 조합·장시간 고손실·재접속 복구·호스트 이전은 이번 검수 완료 범위가 아니다. 큰 스냅샷은 신뢰성 있는 분할 전송을 계속 사용한다.</w:t>
+      </w:r>
+    </w:p>
+    <w:p>
+      <w:pPr>
+        <w:keepLines w:val="0"/>
+        <w:spacing w:after="0" w:before="0" w:line="20" w:lineRule="exact"/>
+      </w:pPr>
+      <w:r>
+        <w:rPr>
+          <w:sz w:val="2"/>
+        </w:rPr>
+        <w:br w:type="page"/>
+      </w:r>
+    </w:p>
+    <w:p>
+      <w:pPr>
+        <w:pStyle w:val="Title"/>
+        <w:keepLines/>
+      </w:pPr>
+      <w:r>
+        <w:t>맥 개발 테스트 패키지</w:t>
+      </w:r>
+    </w:p>
+    <w:p>
+      <w:pPr>
+        <w:pStyle w:val="Case2Body"/>
+        <w:keepLines/>
+      </w:pPr>
+      <w:r>
+        <w:t>2026년 10월 16일  |  사례 03  |  요청 R10</w:t>
+      </w:r>
+    </w:p>
+    <w:p>
+      <w:pPr>
+        <w:pStyle w:val="Case2Body"/>
+        <w:keepLines/>
+      </w:pPr>
+      <w:r>
+        <w:t>진행 중이던 개인전 UI와 참가자 이동 지연 수정을 마무리하고, 같은 게임 소스로 Intel과 Apple Silicon을 지원하는 맥 패키지를 추가했다. Windows 검수 결과는 사례02에 보존했다. 맥 패키지는 파일 검증까지 완료했고 실제 맥 실행은 미검증이다.</w:t>
+      </w:r>
+    </w:p>
+    <w:p>
+      <w:pPr>
+        <w:pStyle w:val="Heading2"/>
+        <w:keepLines/>
+      </w:pPr>
+      <w:r>
+        <w:t>빌드 환경과 처리</w:t>
+      </w:r>
+    </w:p>
+    <w:p>
+      <w:pPr>
+        <w:pStyle w:val="Case2Body"/>
+        <w:keepLines/>
+      </w:pPr>
+      <w:r>
+        <w:t>설치된 Unity 6000.5.10f1에 정확히 맞는 공식 Mac Mono 모듈을 추가했다. Unity 서명과 배포 매니페스트 MD5를 확인한 설치 파일만 사용했다. SampleScene을 Universal x86_64·arm64, Mono 일반 빌드, LZ4로 빌드했다. 게임 코드 변경은 없으며 네트워크 버전은 Windows와 같은 Protocol3이다.</w:t>
+      </w:r>
+    </w:p>
+    <w:p>
+      <w:pPr>
+        <w:pStyle w:val="Heading2"/>
+        <w:keepLines/>
+      </w:pPr>
+      <w:r>
+        <w:t>실제 파일 검증</w:t>
+      </w:r>
+    </w:p>
+    <w:p>
+      <w:pPr>
+        <w:pStyle w:val="Case2Body"/>
+        <w:keepLines/>
+      </w:pPr>
+      <w:r>
+        <w:t>최종 Unity 빌드 성공: 55.92초, 201.17MB. Info.plist의 최소 OS는 macOS 12.0이다. 실행 파일과 네이티브 라이브러리 6개 모두 두 CPU 아키텍처를 확인했다. 앱 데이터·관리 코드 포함, ZIP CRC와 Mach-O 및 .command의 UNIX 실행 권한을 검증했다. ZIP 크기는 110.9MiB다.</w:t>
+      </w:r>
+    </w:p>
+    <w:p>
+      <w:pPr>
+        <w:pStyle w:val="Heading2"/>
+        <w:keepLines/>
+      </w:pPr>
+      <w:r>
+        <w:t>실행과 연결</w:t>
+      </w:r>
+    </w:p>
+    <w:p>
+      <w:pPr>
+        <w:pStyle w:val="Case2Body"/>
+        <w:keepLines/>
+      </w:pPr>
+      <w:r>
+        <w:t>맥에서 ZIP 전체를 풀고 MonsterDeliveryService.app을 실행한다. Test_1v1.command와 Test_2v2.command는 한 맥에서 각각2개·4개 창을 연다. 다른 PC 접속은 방장 IPv4 또는 방 코드 방식이다. 참가자 전원이 Protocol3 최신 패키지를 사용한다. Windows 패키지는 기존 UI_NetworkFix 검수본을 그대로 제공한다.</w:t>
+      </w:r>
+    </w:p>
+    <w:p>
+      <w:pPr>
+        <w:pStyle w:val="Heading2"/>
+        <w:keepLines/>
+      </w:pPr>
+      <w:r>
+        <w:t>재시도와 진단</w:t>
+      </w:r>
+    </w:p>
+    <w:p>
+      <w:pPr>
+        <w:pStyle w:val="Case2Body"/>
+        <w:keepLines/>
+      </w:pPr>
+      <w:r>
+        <w:t>첫 시도는 플랫폼 전환 중 컴파일로 중단됐다. 모듈 설치 후에는 도구가 성공으로 표시해도 실제 앱이 없어 배포에서 제외했다. 저장된 Editor를 정상 재시작해 모듈을 로드했다. 이후 Development 빌드의 Burst dSYM 생성이 경로 누락으로 실패했다. 디버그 심볼을 생성하지 않는 일반 빌드로 다시 만들어 실제 앱을 검사했다. 이전 실패와 최종 결과를 진단 파일에 구분했다.</w:t>
+      </w:r>
+    </w:p>
+    <w:p>
+      <w:pPr>
+        <w:pStyle w:val="Heading2"/>
+        <w:keepLines/>
+      </w:pPr>
+      <w:r>
+        <w:t>남은 확인</w:t>
+      </w:r>
+    </w:p>
+    <w:p>
+      <w:pPr>
+        <w:pStyle w:val="Case2Body"/>
+        <w:keepLines/>
+      </w:pPr>
+      <w:r>
+        <w:t>실제 맥에서의 첫 실행·키 입력·프레임·멀티플레이, Windows↔Mac 연결은 이 Windows 환경에서 확인하지 않았다. 맥 플레이 화면 캡처도 없으며 Windows 캡처를 맥 검증으로 대신하지 않았다. Apple Developer ID 서명과 공증은 수행하지 않아 첫 실행 시 macOS 확인이 필요할 수 있다. 일반 빌드에는 개발용 자동 지연 재현·진단 오버레이가 포함되지 않는다. 기존 UnityPipeline 누락 DLL 진단은 빌드 환경 문제로 따로 기록했다.</w:t>
+      </w:r>
+    </w:p>
+    <w:p>
+      <w:pPr>
+        <w:pStyle w:val="Case2Body"/>
+        <w:keepLines/>
+      </w:pPr>
+      <w:r>
+        <w:t>근거: evidence/build-macos.json, evidence/package-verification-macos.json, evidence/macos-build-diagnostics.txt. 실행 안내와 BUILD_INFO.json은 맥 ZIP에 포함했다.</w:t>
+      </w:r>
+    </w:p>
     <w:sectPr>
       <w:footerReference w:type="default" r:id="rId14"/>
       <w:pgSz w:w="11909" w:h="16834"/>
@@ -12944,6 +14298,16 @@
         <w:shd w:val="clear" w:color="auto" w:fill="FBCAA2" w:themeFill="accent6" w:themeFillTint="7F"/>
       </w:tcPr>
     </w:tblStylePr>
+  </w:style>
+  <w:style w:type="paragraph" w:customStyle="1" w:styleId="Case2Body">
+    <w:name w:val="Case2Body"/>
+    <w:basedOn w:val="Normal"/>
+    <w:pPr>
+      <w:spacing w:after="120" w:line="252" w:lineRule="auto"/>
+    </w:pPr>
+    <w:rPr>
+      <w:sz w:val="21"/>
+    </w:rPr>
   </w:style>
 </w:styles>
 </file>

</xml_diff>